<commit_message>
Address external 0904 feedback: rename 300-object pool terminology, add 276-holdout schedule table, close FAC model-selection question, sync letter R2-1 wording, add supplementary reproducibility table
</commit_message>
<xml_diff>
--- a/final/submission_package_CAG/response_to_reviewers_CAG.docx
+++ b/final/submission_package_CAG/response_to_reviewers_CAG.docx
@@ -219,7 +219,7 @@
         <w:t xml:space="preserve"> </w:t>
       </w:r>
       <w:r>
-        <w:t xml:space="preserve">paragraph in Section 4.1. It specifies: the base pipeline (an MVPainter-style geometry-controlled multi-view diffusion model built on a joint six-view latent UNet, used frozen together with its VAE); the adapter input (a five-channel geometric input of a 3-channel normal map, a 1-channel depth map, and a 1-channel foreground mask) and its multi-scale injection into multiple UNet resolution levels; the adapter checkpoint used for all tables and its scale semantics (the requested scale is applied multiplicatively at every injected layer); the sampler and scheduler (Euler discrete, 50 denoising steps); the fixed random seed (42) shared by all schedules within an experiment, so all variants share the same initial latents; the six target views and the ground-truth rendering configuration; and the exact metric implementations (foreground-masked FG-SSIM/Edge-SSIM/PSNR, edge masks derived from depth/normal discontinuities, LPIPS with the AlexNet backbone, and foreground Laplacian-variance/RGB-std/gradient-magnitude diagnostics computed under identical views and masks). The pipeline is reference-image-conditioned; no text prompts are used. (Please see Section 4.1 of the revised manuscript.)</w:t>
+        <w:t xml:space="preserve">paragraph in Section 4.1. It specifies: the base pipeline (an MVPainter-style geometry-controlled multi-view diffusion model built on a joint six-view latent UNet, used frozen together with its VAE); the adapter input (a five-channel geometric input of a 3-channel normal map, a 1-channel depth map, and a 1-channel foreground mask) and its multi-scale injection into multiple UNet resolution levels; the adapter checkpoint used for all tables and its scale semantics (the requested scale is applied multiplicatively at every injected layer); the sampler and scheduler (Euler discrete, 50 denoising steps); the fixed random seed (42) shared by all schedules within an experiment, so all variants share the same initial latents; the six target views and the ground-truth rendering configuration; and the exact metric implementations (foreground-masked FG-SSIM/Edge-SSIM/PSNR, edge masks derived from depth/normal discontinuities, LPIPS with the AlexNet backbone, and foreground Laplacian-variance/RGB-std/gradient-magnitude diagnostics computed under identical views and masks). The pipeline is reference-image-conditioned; no text prompts are used. In addition, the supplementary material now contains a consolidated reproducibility table listing the data source and subsets, the exact base-pipeline and adapter checkpoint identifiers, the scheduler, steps, seed, conditioning, resolution, and metric implementations. (Please see Section 4.1 of the revised manuscript and the reproducibility table in the supplementary material.)</w:t>
       </w:r>
     </w:p>
     <w:p>
@@ -250,7 +250,7 @@
         </w:numPr>
       </w:pPr>
       <w:r>
-        <w:t xml:space="preserve">We now report the complete study design in Section 4.5: a blinded three-alternative forced-choice (3AFC) preference study on 30 validation objects with 24 participants; for each object and each of the three criteria (texture naturalness, shape consistency, overall quality), participants viewed the anonymized outputs of the three conditions side by side; the left-to-right condition order was randomized independently per trial; participants were not informed which method produced which image or how many conditions existed; instructions asked participants to select the best image for the stated criterion only; and every participant judged all 30 objects under all three criteria, yielding 720 valid first-choice decisions per criterion.</w:t>
+        <w:t xml:space="preserve">We now report the complete study design in Section 4.5: a blinded three-alternative forced-choice (3AFC) preference study on 30 objects drawn from the evaluation pool with 24 participants; for each object and each of the three criteria (texture naturalness, shape consistency, overall quality), participants viewed the anonymized outputs of the three conditions side by side; the left-to-right condition order was randomized independently per trial; participants were not informed which method produced which image or how many conditions existed; instructions asked participants to select the best image for the stated criterion only; and every participant judged all 30 objects under all three criteria, yielding 720 valid first-choice decisions per criterion.</w:t>
       </w:r>
     </w:p>
     <w:p>
@@ -303,7 +303,7 @@
         <w:t xml:space="preserve">”</w:t>
       </w:r>
       <w:r>
-        <w:t xml:space="preserve">) reports controlled mechanism probes on additional adapter checkpoints of the same architecture under an identical inference protocol: across three regimes spanning a spectrum of trained residual magnitudes, uniform high scale (s = 2.50) produced (i) texture flattening with the main adapter studied in the paper, (ii) high-frequency artifact amplification with a strong-residual adapter under per-layer caps, and (iii) no appreciable effect with a deliberately weakened adapter. A per-layer scale-cap ablation reproduces both directions on a single checkpoint, isolating the inference-time scale semantics as the determining factor for the failure direction; a residual-magnitude sweep (scaling the adapter’s output projection from 0.1× to 3×) shows that the intervention strength is monotonic in the trained residual magnitude; and a cross-adapter stage ablation shows that even the most sensitive denoising stage is adapter-dependent. What remains stable is stated precisely: in every regime where scaling had a non-negligible effect, the low–high–low temporal schedule (C3) yielded the best shape–texture balance, because concentrating correction in the middle stage exploits the stage-dependent roles of the diffusion process itself. We explicitly acknowledge in Section 5 (Limitations) that the evidence remains within one architecture family and that cross-backbone validation is future work; the contribution is now framed as a conditional structural rule with re-estimable stage utilities rather than a universal optimum. (Please see Sections 4.7 and 5 of the revised manuscript.)</w:t>
+        <w:t xml:space="preserve">) reports controlled mechanism probes on additional adapter checkpoints of the same architecture under an identical inference protocol: across three regimes spanning a spectrum of trained residual magnitudes, uniform high scale (s = 2.50) produced (i) texture flattening with the main adapter studied in the paper, (ii) high-frequency artifact amplification with a strong-residual adapter under per-layer caps, and (iii) no appreciable effect with a deliberately weakened adapter. A per-layer scale-cap ablation reproduces both directions on a single checkpoint, isolating the inference-time scale semantics as the determining factor for the failure direction; a residual-magnitude sweep (scaling the adapter’s output projection from 0.1× to 3×) shows that the intervention strength is monotonic in the trained residual magnitude; and a cross-adapter stage ablation shows that even the most sensitive denoising stage is adapter-dependent. What remains stable is stated precisely: in every regime where scaling had a non-negligible effect, the low–high–low temporal schedule (C3) yielded the best shape–texture balance, because concentrating correction in the middle stage exploits the stage-dependent division of labor observed in our experiments (global layout → geometry refinement → texture synthesis), which we verify across the tested adapter regimes rather than claim as a model-independent property. We explicitly acknowledge in Section 5 (Limitations) that the evidence remains within one architecture family, that the schedule has not yet been validated on a different geometry-conditioned multi-view diffusion backbone, and that cross-backbone validation is future work; the contribution is now framed as a conditional structural rule with re-estimable stage utilities rather than a universal optimum. (Please see Sections 4.7 and 5 of the revised manuscript.)</w:t>
       </w:r>
     </w:p>
     <w:p>
@@ -373,7 +373,7 @@
         <w:pStyle w:val="BodyText"/>
       </w:pPr>
       <w:r>
-        <w:t xml:space="preserve">Response: Done, thank you for this suggestion. Linear warm-up and the cosine bump were regenerated at the full 300-object scale on the strong-residual, per-layer-capped adapter instance described in Section 4.7, and the transfer statistics are reported on the strictly disjoint 276-object holdout (obj_0024–obj_0299; Section 4.7): C3 improves PSNR over linear warm-up by +0.323 dB (95% CI [0.263, 0.386], 214/276 wins) while matching its structure (FG-SSIM difference −0.001, statistically tied), and over the cosine bump by +0.902 dB (95% CI [0.824, 0.981], 253/276 wins) with a higher FG-SSIM (+0.046). Together with the transferred trapezoid (+0.258 dB, CI [0.207, 0.308], 206/276 wins) and Gaussian-peak (+0.324 dB, CI [0.281, 0.367], 232/276 wins) schedules, the holdout ordering matches the probe: warm-up approaches C3 in structure but loses in signal fidelity, and the smooth bump loses in both because its effective high-scale duration is shorter than the full middle third. (Please see Section 4.7 of the revised manuscript.)</w:t>
+        <w:t xml:space="preserve">Response: Done, thank you for this suggestion. Linear warm-up and the cosine bump were regenerated at the full 300-object scale on the strong-residual, per-layer-capped adapter instance described in Section 4.7, and the transfer statistics are reported on the strictly disjoint 276-object holdout (obj_0024–obj_0299; Section 4.7): C3 improves PSNR over linear warm-up by +0.323 dB (95% CI [0.263, 0.386], 214/276 wins) while matching its structure (FG-SSIM difference −0.001, statistically tied), and over the cosine bump by +0.902 dB (95% CI [0.824, 0.981], 253/276 wins) with a higher FG-SSIM (+0.046). Together with the transferred trapezoid (+0.258 dB, CI [0.207, 0.308], 206/276 wins) and Gaussian-peak (+0.324 dB, CI [0.281, 0.367], 232/276 wins) schedules, the holdout ordering matches the probe: warm-up approaches C3 in structure but loses in signal fidelity, and the smooth bump loses in both because its effective high-scale duration is shorter than the full middle third. These statistics are now also summarized in a dedicated scheduling-transfer table (Table 9 in Section 4.7). (Please see Section 4.7 of the revised manuscript.)</w:t>
       </w:r>
     </w:p>
     <w:p>

</xml_diff>

<commit_message>
Split Section 4.1 into three numbered subsections (4.1.1 protocol, 4.1.2 sets/metrics, 4.1.3 implementation) and break the long implementation paragraph; sync letter references to 4.1.3; verify length compliance (8.7k words) and rebuild package artifacts
</commit_message>
<xml_diff>
--- a/final/submission_package_CAG/response_to_reviewers_CAG.docx
+++ b/final/submission_package_CAG/response_to_reviewers_CAG.docx
@@ -219,7 +219,7 @@
         <w:t xml:space="preserve"> </w:t>
       </w:r>
       <w:r>
-        <w:t xml:space="preserve">paragraph in Section 4.1. It specifies: the base pipeline (an MVPainter-style geometry-controlled multi-view diffusion model built on a joint six-view latent UNet, used frozen together with its VAE); the adapter input (a five-channel geometric input of a 3-channel normal map, a 1-channel depth map, and a 1-channel foreground mask) and its multi-scale injection into multiple UNet resolution levels; the adapter checkpoint used for all tables and its scale semantics (the requested scale is applied multiplicatively at every injected layer); the sampler and scheduler (Euler discrete, 50 denoising steps); the fixed random seed (42) shared by all schedules within an experiment, so all variants share the same initial latents; the six target views and the ground-truth rendering configuration; and the exact metric implementations (foreground-masked FG-SSIM/Edge-SSIM/PSNR, edge masks derived from depth/normal discontinuities, LPIPS with the AlexNet backbone, and foreground Laplacian-variance/RGB-std/gradient-magnitude diagnostics computed under identical views and masks). The pipeline is reference-image-conditioned; no text prompts are used. In addition, the supplementary material now contains a consolidated reproducibility table listing the data source and subsets, the exact base-pipeline and adapter checkpoint identifiers, the scheduler, steps, seed, conditioning, resolution, and metric implementations. (Please see Section 4.1 of the revised manuscript and the reproducibility table in the supplementary material.)</w:t>
+        <w:t xml:space="preserve">subsection (Section 4.1.3) with a consolidated reproducibility reference. It specifies: the base pipeline (an MVPainter-style geometry-controlled multi-view diffusion model built on a joint six-view latent UNet, used frozen together with its VAE); the adapter input (a five-channel geometric input of a 3-channel normal map, a 1-channel depth map, and a 1-channel foreground mask) and its multi-scale injection into multiple UNet resolution levels; the adapter checkpoint used for all tables and its scale semantics (the requested scale is applied multiplicatively at every injected layer); the sampler and scheduler (Euler discrete, 50 denoising steps); the fixed random seed (42) shared by all schedules within an experiment, so all variants share the same initial latents; the six target views and the ground-truth rendering configuration; and the exact metric implementations (foreground-masked FG-SSIM/Edge-SSIM/PSNR, edge masks derived from depth/normal discontinuities, LPIPS with the AlexNet backbone, and foreground Laplacian-variance/RGB-std/gradient-magnitude diagnostics computed under identical views and masks). The pipeline is reference-image-conditioned; no text prompts are used. In addition, the supplementary material now contains a consolidated reproducibility table listing the data source and subsets, the exact base-pipeline and adapter checkpoint identifiers, the scheduler, steps, seed, conditioning, resolution, and metric implementations. (Please see Section 4.1 of the revised manuscript and the reproducibility table in the supplementary material.)</w:t>
       </w:r>
     </w:p>
     <w:p>
@@ -457,7 +457,7 @@
         <w:t xml:space="preserve"> </w:t>
       </w:r>
       <w:r>
-        <w:t xml:space="preserve">for C3 vs. s = 2.50); and the 95% confidence interval of the paired mean difference is constructed by object-level percentile bootstrap with 10,000 resamples ([0.0037, 0.0054], excluding zero). For the preference study, two-level (participant- and object-level) cluster-bootstrap intervals are reported in Section 4.5 (please see our response to Comment 3 of Reviewer 1). All other paired statements (stage utilities, holdout deltas) use object-level paired statistics with percentile bootstrap 95% CIs, and the procedure is stated once in Section 4.1. (Please see Sections 4.1 and 4.5 of the revised manuscript.)</w:t>
+        <w:t xml:space="preserve">for C3 vs. s = 2.50); and the 95% confidence interval of the paired mean difference is constructed by object-level percentile bootstrap with 10,000 resamples ([0.0037, 0.0054], excluding zero). For the preference study, two-level (participant- and object-level) cluster-bootstrap intervals are reported in Section 4.5 (please see our response to Comment 3 of Reviewer 1). All other paired statements (stage utilities, holdout deltas) use object-level paired statistics with percentile bootstrap 95% CIs, and the procedure is stated once in Section 4.1.3. (Please see Sections 4.1 and 4.5 of the revised manuscript.)</w:t>
       </w:r>
     </w:p>
     <w:p>

</xml_diff>